<commit_message>
Agregar proyecto Android de GeoCheckIn Seguro
Proyecto de Android Studio en ejercicio1/ (AGP 9.3.1, compileSdk 37) con el
codigo del documento: permisos en runtime, validacion de zona, deteccion de
ubicaciones simuladas, token firmado con HMAC y almacenamiento cifrado.
El documento ahora se genera a partir de este mismo codigo.
</commit_message>
<xml_diff>
--- a/ejercicio1.docx
+++ b/ejercicio1.docx
@@ -35,6 +35,14 @@
         <w:jc w:val="both"/>
       </w:pPr>
       <w:r>
+        <w:t xml:space="preserve">El proyecto completo de Android Studio está en la carpeta ejercicio1/ del repositorio https://github.com/Alessandro-BS/semana07 y compila con Gradle 9.5, AGP 9.3.1 y compileSdk 37.</w:t>
+      </w:r>
+    </w:p>
+    <w:p>
+      <w:pPr>
+        <w:jc w:val="both"/>
+      </w:pPr>
+      <w:r>
         <w:t xml:space="preserve">GeoCheckIn Seguro es una aplicación Android que permite registrar un fichaje (check-in) laboral usando la ubicación del dispositivo. La app solo acepta el fichaje si el usuario se encuentra dentro de la zona de trabajo y guarda un comprobante firmado y cifrado.</w:t>
       </w:r>
     </w:p>
@@ -281,6 +289,20 @@
           <w:noProof/>
           <w:sz w:val="18"/>
         </w:rPr>
+        <w:t xml:space="preserve">        android:fullBackupContent="@xml/backup_rules"</w:t>
+      </w:r>
+    </w:p>
+    <w:p>
+      <w:pPr>
+        <w:shd w:val="clear" w:color="auto" w:fill="F2F2F2"/>
+        <w:spacing w:after="0" w:line="240" w:lineRule="auto"/>
+      </w:pPr>
+      <w:r>
+        <w:rPr>
+          <w:rFonts w:ascii="Consolas" w:hAnsi="Consolas" w:cs="Consolas"/>
+          <w:noProof/>
+          <w:sz w:val="18"/>
+        </w:rPr>
         <w:t xml:space="preserve">        android:icon="@mipmap/ic_launcher"</w:t>
       </w:r>
     </w:p>
@@ -323,7 +345,7 @@
           <w:noProof/>
           <w:sz w:val="18"/>
         </w:rPr>
-        <w:t xml:space="preserve">        android:theme="@style/Theme.MaterialComponents.DayNight.DarkActionBar"&gt;</w:t>
+        <w:t xml:space="preserve">        android:theme="@style/Theme.GeoCheckIn"&gt;</w:t>
       </w:r>
     </w:p>
     <w:p>
@@ -487,7 +509,7 @@
           <w:b/>
           <w:highlight w:val="yellow"/>
         </w:rPr>
-        <w:t xml:space="preserve">res/xml/data_extraction_rules.xml</w:t>
+        <w:t xml:space="preserve">res/xml/data_extraction_rules.xml (Android 12+)</w:t>
       </w:r>
     </w:p>
     <w:p>
@@ -659,415 +681,77 @@
           <w:b/>
           <w:highlight w:val="yellow"/>
         </w:rPr>
-        <w:t xml:space="preserve">build.gradle.kts (Módulo de App)</w:t>
-      </w:r>
-    </w:p>
-    <w:p>
-      <w:pPr>
-        <w:shd w:val="clear" w:color="auto" w:fill="F2F2F2"/>
-        <w:spacing w:after="0" w:line="240" w:lineRule="auto"/>
-      </w:pPr>
-      <w:r>
-        <w:rPr>
-          <w:rFonts w:ascii="Consolas" w:hAnsi="Consolas" w:cs="Consolas"/>
-          <w:noProof/>
-          <w:sz w:val="18"/>
-        </w:rPr>
-        <w:t xml:space="preserve">plugins {</w:t>
-      </w:r>
-    </w:p>
-    <w:p>
-      <w:pPr>
-        <w:shd w:val="clear" w:color="auto" w:fill="F2F2F2"/>
-        <w:spacing w:after="0" w:line="240" w:lineRule="auto"/>
-      </w:pPr>
-      <w:r>
-        <w:rPr>
-          <w:rFonts w:ascii="Consolas" w:hAnsi="Consolas" w:cs="Consolas"/>
-          <w:noProof/>
-          <w:sz w:val="18"/>
-        </w:rPr>
-        <w:t xml:space="preserve">    id("com.android.application")</w:t>
-      </w:r>
-    </w:p>
-    <w:p>
-      <w:pPr>
-        <w:shd w:val="clear" w:color="auto" w:fill="F2F2F2"/>
-        <w:spacing w:after="0" w:line="240" w:lineRule="auto"/>
-      </w:pPr>
-      <w:r>
-        <w:rPr>
-          <w:rFonts w:ascii="Consolas" w:hAnsi="Consolas" w:cs="Consolas"/>
-          <w:noProof/>
-          <w:sz w:val="18"/>
-        </w:rPr>
-        <w:t xml:space="preserve">    id("org.jetbrains.kotlin.android")</w:t>
-      </w:r>
-    </w:p>
-    <w:p>
-      <w:pPr>
-        <w:shd w:val="clear" w:color="auto" w:fill="F2F2F2"/>
-        <w:spacing w:after="0" w:line="240" w:lineRule="auto"/>
-      </w:pPr>
-      <w:r>
-        <w:rPr>
-          <w:rFonts w:ascii="Consolas" w:hAnsi="Consolas" w:cs="Consolas"/>
-          <w:noProof/>
-          <w:sz w:val="18"/>
-        </w:rPr>
-        <w:t xml:space="preserve">}</w:t>
-      </w:r>
-    </w:p>
-    <w:p>
-      <w:pPr>
-        <w:shd w:val="clear" w:color="auto" w:fill="F2F2F2"/>
-        <w:spacing w:after="0" w:line="240" w:lineRule="auto"/>
-      </w:pPr>
-    </w:p>
-    <w:p>
-      <w:pPr>
-        <w:shd w:val="clear" w:color="auto" w:fill="F2F2F2"/>
-        <w:spacing w:after="0" w:line="240" w:lineRule="auto"/>
-      </w:pPr>
-      <w:r>
-        <w:rPr>
-          <w:rFonts w:ascii="Consolas" w:hAnsi="Consolas" w:cs="Consolas"/>
-          <w:noProof/>
-          <w:sz w:val="18"/>
-        </w:rPr>
-        <w:t xml:space="preserve">android {</w:t>
-      </w:r>
-    </w:p>
-    <w:p>
-      <w:pPr>
-        <w:shd w:val="clear" w:color="auto" w:fill="F2F2F2"/>
-        <w:spacing w:after="0" w:line="240" w:lineRule="auto"/>
-      </w:pPr>
-      <w:r>
-        <w:rPr>
-          <w:rFonts w:ascii="Consolas" w:hAnsi="Consolas" w:cs="Consolas"/>
-          <w:noProof/>
-          <w:sz w:val="18"/>
-        </w:rPr>
-        <w:t xml:space="preserve">    // Con AGP 8+ el paquete se declara aquí y no en el atributo package del Manifest</w:t>
-      </w:r>
-    </w:p>
-    <w:p>
-      <w:pPr>
-        <w:shd w:val="clear" w:color="auto" w:fill="F2F2F2"/>
-        <w:spacing w:after="0" w:line="240" w:lineRule="auto"/>
-      </w:pPr>
-      <w:r>
-        <w:rPr>
-          <w:rFonts w:ascii="Consolas" w:hAnsi="Consolas" w:cs="Consolas"/>
-          <w:noProof/>
-          <w:sz w:val="18"/>
-        </w:rPr>
-        <w:t xml:space="preserve">    namespace = "com.example.geocheckin"</w:t>
-      </w:r>
-    </w:p>
-    <w:p>
-      <w:pPr>
-        <w:shd w:val="clear" w:color="auto" w:fill="F2F2F2"/>
-        <w:spacing w:after="0" w:line="240" w:lineRule="auto"/>
-      </w:pPr>
-      <w:r>
-        <w:rPr>
-          <w:rFonts w:ascii="Consolas" w:hAnsi="Consolas" w:cs="Consolas"/>
-          <w:noProof/>
-          <w:sz w:val="18"/>
-        </w:rPr>
-        <w:t xml:space="preserve">    compileSdk = 34</w:t>
-      </w:r>
-    </w:p>
-    <w:p>
-      <w:pPr>
-        <w:shd w:val="clear" w:color="auto" w:fill="F2F2F2"/>
-        <w:spacing w:after="0" w:line="240" w:lineRule="auto"/>
-      </w:pPr>
-    </w:p>
-    <w:p>
-      <w:pPr>
-        <w:shd w:val="clear" w:color="auto" w:fill="F2F2F2"/>
-        <w:spacing w:after="0" w:line="240" w:lineRule="auto"/>
-      </w:pPr>
-      <w:r>
-        <w:rPr>
-          <w:rFonts w:ascii="Consolas" w:hAnsi="Consolas" w:cs="Consolas"/>
-          <w:noProof/>
-          <w:sz w:val="18"/>
-        </w:rPr>
-        <w:t xml:space="preserve">    defaultConfig {</w:t>
-      </w:r>
-    </w:p>
-    <w:p>
-      <w:pPr>
-        <w:shd w:val="clear" w:color="auto" w:fill="F2F2F2"/>
-        <w:spacing w:after="0" w:line="240" w:lineRule="auto"/>
-      </w:pPr>
-      <w:r>
-        <w:rPr>
-          <w:rFonts w:ascii="Consolas" w:hAnsi="Consolas" w:cs="Consolas"/>
-          <w:noProof/>
-          <w:sz w:val="18"/>
-        </w:rPr>
-        <w:t xml:space="preserve">        applicationId = "com.example.geocheckin"</w:t>
-      </w:r>
-    </w:p>
-    <w:p>
-      <w:pPr>
-        <w:shd w:val="clear" w:color="auto" w:fill="F2F2F2"/>
-        <w:spacing w:after="0" w:line="240" w:lineRule="auto"/>
-      </w:pPr>
-      <w:r>
-        <w:rPr>
-          <w:rFonts w:ascii="Consolas" w:hAnsi="Consolas" w:cs="Consolas"/>
-          <w:noProof/>
-          <w:sz w:val="18"/>
-        </w:rPr>
-        <w:t xml:space="preserve">        minSdk = 24</w:t>
-      </w:r>
-    </w:p>
-    <w:p>
-      <w:pPr>
-        <w:shd w:val="clear" w:color="auto" w:fill="F2F2F2"/>
-        <w:spacing w:after="0" w:line="240" w:lineRule="auto"/>
-      </w:pPr>
-      <w:r>
-        <w:rPr>
-          <w:rFonts w:ascii="Consolas" w:hAnsi="Consolas" w:cs="Consolas"/>
-          <w:noProof/>
-          <w:sz w:val="18"/>
-        </w:rPr>
-        <w:t xml:space="preserve">        targetSdk = 34</w:t>
-      </w:r>
-    </w:p>
-    <w:p>
-      <w:pPr>
-        <w:shd w:val="clear" w:color="auto" w:fill="F2F2F2"/>
-        <w:spacing w:after="0" w:line="240" w:lineRule="auto"/>
-      </w:pPr>
-      <w:r>
-        <w:rPr>
-          <w:rFonts w:ascii="Consolas" w:hAnsi="Consolas" w:cs="Consolas"/>
-          <w:noProof/>
-          <w:sz w:val="18"/>
-        </w:rPr>
-        <w:t xml:space="preserve">        versionCode = 1</w:t>
-      </w:r>
-    </w:p>
-    <w:p>
-      <w:pPr>
-        <w:shd w:val="clear" w:color="auto" w:fill="F2F2F2"/>
-        <w:spacing w:after="0" w:line="240" w:lineRule="auto"/>
-      </w:pPr>
-      <w:r>
-        <w:rPr>
-          <w:rFonts w:ascii="Consolas" w:hAnsi="Consolas" w:cs="Consolas"/>
-          <w:noProof/>
-          <w:sz w:val="18"/>
-        </w:rPr>
-        <w:t xml:space="preserve">        versionName = "1.0"</w:t>
-      </w:r>
-    </w:p>
-    <w:p>
-      <w:pPr>
-        <w:shd w:val="clear" w:color="auto" w:fill="F2F2F2"/>
-        <w:spacing w:after="0" w:line="240" w:lineRule="auto"/>
-      </w:pPr>
-      <w:r>
-        <w:rPr>
-          <w:rFonts w:ascii="Consolas" w:hAnsi="Consolas" w:cs="Consolas"/>
-          <w:noProof/>
-          <w:sz w:val="18"/>
-        </w:rPr>
-        <w:t xml:space="preserve">    }</w:t>
-      </w:r>
-    </w:p>
-    <w:p>
-      <w:pPr>
-        <w:shd w:val="clear" w:color="auto" w:fill="F2F2F2"/>
-        <w:spacing w:after="0" w:line="240" w:lineRule="auto"/>
-      </w:pPr>
-      <w:r>
-        <w:rPr>
-          <w:rFonts w:ascii="Consolas" w:hAnsi="Consolas" w:cs="Consolas"/>
-          <w:noProof/>
-          <w:sz w:val="18"/>
-        </w:rPr>
-        <w:t xml:space="preserve">}</w:t>
-      </w:r>
-    </w:p>
-    <w:p>
-      <w:pPr>
-        <w:shd w:val="clear" w:color="auto" w:fill="F2F2F2"/>
-        <w:spacing w:after="0" w:line="240" w:lineRule="auto"/>
-      </w:pPr>
-    </w:p>
-    <w:p>
-      <w:pPr>
-        <w:shd w:val="clear" w:color="auto" w:fill="F2F2F2"/>
-        <w:spacing w:after="0" w:line="240" w:lineRule="auto"/>
-      </w:pPr>
-      <w:r>
-        <w:rPr>
-          <w:rFonts w:ascii="Consolas" w:hAnsi="Consolas" w:cs="Consolas"/>
-          <w:noProof/>
-          <w:sz w:val="18"/>
-        </w:rPr>
-        <w:t xml:space="preserve">dependencies {</w:t>
-      </w:r>
-    </w:p>
-    <w:p>
-      <w:pPr>
-        <w:shd w:val="clear" w:color="auto" w:fill="F2F2F2"/>
-        <w:spacing w:after="0" w:line="240" w:lineRule="auto"/>
-      </w:pPr>
-      <w:r>
-        <w:rPr>
-          <w:rFonts w:ascii="Consolas" w:hAnsi="Consolas" w:cs="Consolas"/>
-          <w:noProof/>
-          <w:sz w:val="18"/>
-        </w:rPr>
-        <w:t xml:space="preserve">    // Servicios de Ubicación de Google Play</w:t>
-      </w:r>
-    </w:p>
-    <w:p>
-      <w:pPr>
-        <w:shd w:val="clear" w:color="auto" w:fill="F2F2F2"/>
-        <w:spacing w:after="0" w:line="240" w:lineRule="auto"/>
-      </w:pPr>
-      <w:r>
-        <w:rPr>
-          <w:rFonts w:ascii="Consolas" w:hAnsi="Consolas" w:cs="Consolas"/>
-          <w:noProof/>
-          <w:sz w:val="18"/>
-        </w:rPr>
-        <w:t xml:space="preserve">    implementation("com.google.android.gms:play-services-location:21.0.1")</w:t>
-      </w:r>
-    </w:p>
-    <w:p>
-      <w:pPr>
-        <w:shd w:val="clear" w:color="auto" w:fill="F2F2F2"/>
-        <w:spacing w:after="0" w:line="240" w:lineRule="auto"/>
-      </w:pPr>
-    </w:p>
-    <w:p>
-      <w:pPr>
-        <w:shd w:val="clear" w:color="auto" w:fill="F2F2F2"/>
-        <w:spacing w:after="0" w:line="240" w:lineRule="auto"/>
-      </w:pPr>
-      <w:r>
-        <w:rPr>
-          <w:rFonts w:ascii="Consolas" w:hAnsi="Consolas" w:cs="Consolas"/>
-          <w:noProof/>
-          <w:sz w:val="18"/>
-        </w:rPr>
-        <w:t xml:space="preserve">    // Jetpack Security (Keystore + EncryptedSharedPreferences)</w:t>
-      </w:r>
-    </w:p>
-    <w:p>
-      <w:pPr>
-        <w:shd w:val="clear" w:color="auto" w:fill="F2F2F2"/>
-        <w:spacing w:after="0" w:line="240" w:lineRule="auto"/>
-      </w:pPr>
-      <w:r>
-        <w:rPr>
-          <w:rFonts w:ascii="Consolas" w:hAnsi="Consolas" w:cs="Consolas"/>
-          <w:noProof/>
-          <w:sz w:val="18"/>
-        </w:rPr>
-        <w:t xml:space="preserve">    // Nota: versión alfa; Google la marcó como obsoleta (ver Conclusiones)</w:t>
-      </w:r>
-    </w:p>
-    <w:p>
-      <w:pPr>
-        <w:shd w:val="clear" w:color="auto" w:fill="F2F2F2"/>
-        <w:spacing w:after="0" w:line="240" w:lineRule="auto"/>
-      </w:pPr>
-      <w:r>
-        <w:rPr>
-          <w:rFonts w:ascii="Consolas" w:hAnsi="Consolas" w:cs="Consolas"/>
-          <w:noProof/>
-          <w:sz w:val="18"/>
-        </w:rPr>
-        <w:t xml:space="preserve">    implementation("androidx.security:security-crypto:1.1.0-alpha06")</w:t>
-      </w:r>
-    </w:p>
-    <w:p>
-      <w:pPr>
-        <w:shd w:val="clear" w:color="auto" w:fill="F2F2F2"/>
-        <w:spacing w:after="0" w:line="240" w:lineRule="auto"/>
-      </w:pPr>
-    </w:p>
-    <w:p>
-      <w:pPr>
-        <w:shd w:val="clear" w:color="auto" w:fill="F2F2F2"/>
-        <w:spacing w:after="0" w:line="240" w:lineRule="auto"/>
-      </w:pPr>
-      <w:r>
-        <w:rPr>
-          <w:rFonts w:ascii="Consolas" w:hAnsi="Consolas" w:cs="Consolas"/>
-          <w:noProof/>
-          <w:sz w:val="18"/>
-        </w:rPr>
-        <w:t xml:space="preserve">    // Componentes de Arquitectura</w:t>
-      </w:r>
-    </w:p>
-    <w:p>
-      <w:pPr>
-        <w:shd w:val="clear" w:color="auto" w:fill="F2F2F2"/>
-        <w:spacing w:after="0" w:line="240" w:lineRule="auto"/>
-      </w:pPr>
-      <w:r>
-        <w:rPr>
-          <w:rFonts w:ascii="Consolas" w:hAnsi="Consolas" w:cs="Consolas"/>
-          <w:noProof/>
-          <w:sz w:val="18"/>
-        </w:rPr>
-        <w:t xml:space="preserve">    implementation("androidx.core:core-ktx:1.12.0")</w:t>
-      </w:r>
-    </w:p>
-    <w:p>
-      <w:pPr>
-        <w:shd w:val="clear" w:color="auto" w:fill="F2F2F2"/>
-        <w:spacing w:after="0" w:line="240" w:lineRule="auto"/>
-      </w:pPr>
-      <w:r>
-        <w:rPr>
-          <w:rFonts w:ascii="Consolas" w:hAnsi="Consolas" w:cs="Consolas"/>
-          <w:noProof/>
-          <w:sz w:val="18"/>
-        </w:rPr>
-        <w:t xml:space="preserve">    implementation("androidx.appcompat:appcompat:1.6.1")</w:t>
-      </w:r>
-    </w:p>
-    <w:p>
-      <w:pPr>
-        <w:shd w:val="clear" w:color="auto" w:fill="F2F2F2"/>
-        <w:spacing w:after="0" w:line="240" w:lineRule="auto"/>
-      </w:pPr>
-      <w:r>
-        <w:rPr>
-          <w:rFonts w:ascii="Consolas" w:hAnsi="Consolas" w:cs="Consolas"/>
-          <w:noProof/>
-          <w:sz w:val="18"/>
-        </w:rPr>
-        <w:t xml:space="preserve">    implementation("com.google.android.material:material:1.11.0")</w:t>
-      </w:r>
-    </w:p>
-    <w:p>
-      <w:pPr>
-        <w:shd w:val="clear" w:color="auto" w:fill="F2F2F2"/>
-        <w:spacing w:after="0" w:line="240" w:lineRule="auto"/>
-      </w:pPr>
-      <w:r>
-        <w:rPr>
-          <w:rFonts w:ascii="Consolas" w:hAnsi="Consolas" w:cs="Consolas"/>
-          <w:noProof/>
-          <w:sz w:val="18"/>
-        </w:rPr>
-        <w:t xml:space="preserve">}</w:t>
+        <w:t xml:space="preserve">res/xml/backup_rules.xml (Android 11 o inferior)</w:t>
+      </w:r>
+    </w:p>
+    <w:p>
+      <w:pPr>
+        <w:shd w:val="clear" w:color="auto" w:fill="F2F2F2"/>
+        <w:spacing w:after="0" w:line="240" w:lineRule="auto"/>
+      </w:pPr>
+      <w:r>
+        <w:rPr>
+          <w:rFonts w:ascii="Consolas" w:hAnsi="Consolas" w:cs="Consolas"/>
+          <w:noProof/>
+          <w:sz w:val="18"/>
+        </w:rPr>
+        <w:t xml:space="preserve">&lt;?xml version="1.0" encoding="utf-8"?&gt;</w:t>
+      </w:r>
+    </w:p>
+    <w:p>
+      <w:pPr>
+        <w:shd w:val="clear" w:color="auto" w:fill="F2F2F2"/>
+        <w:spacing w:after="0" w:line="240" w:lineRule="auto"/>
+      </w:pPr>
+      <w:r>
+        <w:rPr>
+          <w:rFonts w:ascii="Consolas" w:hAnsi="Consolas" w:cs="Consolas"/>
+          <w:noProof/>
+          <w:sz w:val="18"/>
+        </w:rPr>
+        <w:t xml:space="preserve">&lt;!-- Android 11 o inferior: excluye las preferencias cifradas de cualquier copia de seguridad --&gt;</w:t>
+      </w:r>
+    </w:p>
+    <w:p>
+      <w:pPr>
+        <w:shd w:val="clear" w:color="auto" w:fill="F2F2F2"/>
+        <w:spacing w:after="0" w:line="240" w:lineRule="auto"/>
+      </w:pPr>
+      <w:r>
+        <w:rPr>
+          <w:rFonts w:ascii="Consolas" w:hAnsi="Consolas" w:cs="Consolas"/>
+          <w:noProof/>
+          <w:sz w:val="18"/>
+        </w:rPr>
+        <w:t xml:space="preserve">&lt;full-backup-content&gt;</w:t>
+      </w:r>
+    </w:p>
+    <w:p>
+      <w:pPr>
+        <w:shd w:val="clear" w:color="auto" w:fill="F2F2F2"/>
+        <w:spacing w:after="0" w:line="240" w:lineRule="auto"/>
+      </w:pPr>
+      <w:r>
+        <w:rPr>
+          <w:rFonts w:ascii="Consolas" w:hAnsi="Consolas" w:cs="Consolas"/>
+          <w:noProof/>
+          <w:sz w:val="18"/>
+        </w:rPr>
+        <w:t xml:space="preserve">    &lt;exclude domain="sharedpref" path="secure_geo_prefs.xml" /&gt;</w:t>
+      </w:r>
+    </w:p>
+    <w:p>
+      <w:pPr>
+        <w:shd w:val="clear" w:color="auto" w:fill="F2F2F2"/>
+        <w:spacing w:after="0" w:line="240" w:lineRule="auto"/>
+      </w:pPr>
+      <w:r>
+        <w:rPr>
+          <w:rFonts w:ascii="Consolas" w:hAnsi="Consolas" w:cs="Consolas"/>
+          <w:noProof/>
+          <w:sz w:val="18"/>
+        </w:rPr>
+        <w:t xml:space="preserve">&lt;/full-backup-content&gt;</w:t>
       </w:r>
     </w:p>
     <w:p>
@@ -1085,6 +769,854 @@
           <w:b/>
           <w:highlight w:val="yellow"/>
         </w:rPr>
+        <w:t xml:space="preserve">gradle/libs.versions.toml</w:t>
+      </w:r>
+    </w:p>
+    <w:p>
+      <w:pPr>
+        <w:jc w:val="both"/>
+      </w:pPr>
+      <w:r>
+        <w:t xml:space="preserve">Las versiones de las librerías se centralizan en el catálogo de versiones de Gradle.</w:t>
+      </w:r>
+    </w:p>
+    <w:p>
+      <w:pPr>
+        <w:shd w:val="clear" w:color="auto" w:fill="F2F2F2"/>
+        <w:spacing w:after="0" w:line="240" w:lineRule="auto"/>
+      </w:pPr>
+      <w:r>
+        <w:rPr>
+          <w:rFonts w:ascii="Consolas" w:hAnsi="Consolas" w:cs="Consolas"/>
+          <w:noProof/>
+          <w:sz w:val="18"/>
+        </w:rPr>
+        <w:t xml:space="preserve">[versions]</w:t>
+      </w:r>
+    </w:p>
+    <w:p>
+      <w:pPr>
+        <w:shd w:val="clear" w:color="auto" w:fill="F2F2F2"/>
+        <w:spacing w:after="0" w:line="240" w:lineRule="auto"/>
+      </w:pPr>
+      <w:r>
+        <w:rPr>
+          <w:rFonts w:ascii="Consolas" w:hAnsi="Consolas" w:cs="Consolas"/>
+          <w:noProof/>
+          <w:sz w:val="18"/>
+        </w:rPr>
+        <w:t xml:space="preserve">agp = "9.3.1"</w:t>
+      </w:r>
+    </w:p>
+    <w:p>
+      <w:pPr>
+        <w:shd w:val="clear" w:color="auto" w:fill="F2F2F2"/>
+        <w:spacing w:after="0" w:line="240" w:lineRule="auto"/>
+      </w:pPr>
+      <w:r>
+        <w:rPr>
+          <w:rFonts w:ascii="Consolas" w:hAnsi="Consolas" w:cs="Consolas"/>
+          <w:noProof/>
+          <w:sz w:val="18"/>
+        </w:rPr>
+        <w:t xml:space="preserve">coreKtx = "1.19.1"</w:t>
+      </w:r>
+    </w:p>
+    <w:p>
+      <w:pPr>
+        <w:shd w:val="clear" w:color="auto" w:fill="F2F2F2"/>
+        <w:spacing w:after="0" w:line="240" w:lineRule="auto"/>
+      </w:pPr>
+      <w:r>
+        <w:rPr>
+          <w:rFonts w:ascii="Consolas" w:hAnsi="Consolas" w:cs="Consolas"/>
+          <w:noProof/>
+          <w:sz w:val="18"/>
+        </w:rPr>
+        <w:t xml:space="preserve">appcompat = "1.8.0"</w:t>
+      </w:r>
+    </w:p>
+    <w:p>
+      <w:pPr>
+        <w:shd w:val="clear" w:color="auto" w:fill="F2F2F2"/>
+        <w:spacing w:after="0" w:line="240" w:lineRule="auto"/>
+      </w:pPr>
+      <w:r>
+        <w:rPr>
+          <w:rFonts w:ascii="Consolas" w:hAnsi="Consolas" w:cs="Consolas"/>
+          <w:noProof/>
+          <w:sz w:val="18"/>
+        </w:rPr>
+        <w:t xml:space="preserve">material = "1.14.0"</w:t>
+      </w:r>
+    </w:p>
+    <w:p>
+      <w:pPr>
+        <w:shd w:val="clear" w:color="auto" w:fill="F2F2F2"/>
+        <w:spacing w:after="0" w:line="240" w:lineRule="auto"/>
+      </w:pPr>
+      <w:r>
+        <w:rPr>
+          <w:rFonts w:ascii="Consolas" w:hAnsi="Consolas" w:cs="Consolas"/>
+          <w:noProof/>
+          <w:sz w:val="18"/>
+        </w:rPr>
+        <w:t xml:space="preserve">playServicesLocation = "21.4.0"</w:t>
+      </w:r>
+    </w:p>
+    <w:p>
+      <w:pPr>
+        <w:shd w:val="clear" w:color="auto" w:fill="F2F2F2"/>
+        <w:spacing w:after="0" w:line="240" w:lineRule="auto"/>
+      </w:pPr>
+      <w:r>
+        <w:rPr>
+          <w:rFonts w:ascii="Consolas" w:hAnsi="Consolas" w:cs="Consolas"/>
+          <w:noProof/>
+          <w:sz w:val="18"/>
+        </w:rPr>
+        <w:t xml:space="preserve">securityCrypto = "1.1.0"</w:t>
+      </w:r>
+    </w:p>
+    <w:p>
+      <w:pPr>
+        <w:shd w:val="clear" w:color="auto" w:fill="F2F2F2"/>
+        <w:spacing w:after="0" w:line="240" w:lineRule="auto"/>
+      </w:pPr>
+    </w:p>
+    <w:p>
+      <w:pPr>
+        <w:shd w:val="clear" w:color="auto" w:fill="F2F2F2"/>
+        <w:spacing w:after="0" w:line="240" w:lineRule="auto"/>
+      </w:pPr>
+      <w:r>
+        <w:rPr>
+          <w:rFonts w:ascii="Consolas" w:hAnsi="Consolas" w:cs="Consolas"/>
+          <w:noProof/>
+          <w:sz w:val="18"/>
+        </w:rPr>
+        <w:t xml:space="preserve">[libraries]</w:t>
+      </w:r>
+    </w:p>
+    <w:p>
+      <w:pPr>
+        <w:shd w:val="clear" w:color="auto" w:fill="F2F2F2"/>
+        <w:spacing w:after="0" w:line="240" w:lineRule="auto"/>
+      </w:pPr>
+      <w:r>
+        <w:rPr>
+          <w:rFonts w:ascii="Consolas" w:hAnsi="Consolas" w:cs="Consolas"/>
+          <w:noProof/>
+          <w:sz w:val="18"/>
+        </w:rPr>
+        <w:t xml:space="preserve">androidx-core-ktx = { group = "androidx.core", name = "core-ktx", version.ref = "coreKtx" }</w:t>
+      </w:r>
+    </w:p>
+    <w:p>
+      <w:pPr>
+        <w:shd w:val="clear" w:color="auto" w:fill="F2F2F2"/>
+        <w:spacing w:after="0" w:line="240" w:lineRule="auto"/>
+      </w:pPr>
+      <w:r>
+        <w:rPr>
+          <w:rFonts w:ascii="Consolas" w:hAnsi="Consolas" w:cs="Consolas"/>
+          <w:noProof/>
+          <w:sz w:val="18"/>
+        </w:rPr>
+        <w:t xml:space="preserve">androidx-appcompat = { group = "androidx.appcompat", name = "appcompat", version.ref = "appcompat" }</w:t>
+      </w:r>
+    </w:p>
+    <w:p>
+      <w:pPr>
+        <w:shd w:val="clear" w:color="auto" w:fill="F2F2F2"/>
+        <w:spacing w:after="0" w:line="240" w:lineRule="auto"/>
+      </w:pPr>
+      <w:r>
+        <w:rPr>
+          <w:rFonts w:ascii="Consolas" w:hAnsi="Consolas" w:cs="Consolas"/>
+          <w:noProof/>
+          <w:sz w:val="18"/>
+        </w:rPr>
+        <w:t xml:space="preserve">material = { group = "com.google.android.material", name = "material", version.ref = "material" }</w:t>
+      </w:r>
+    </w:p>
+    <w:p>
+      <w:pPr>
+        <w:shd w:val="clear" w:color="auto" w:fill="F2F2F2"/>
+        <w:spacing w:after="0" w:line="240" w:lineRule="auto"/>
+      </w:pPr>
+      <w:r>
+        <w:rPr>
+          <w:rFonts w:ascii="Consolas" w:hAnsi="Consolas" w:cs="Consolas"/>
+          <w:noProof/>
+          <w:sz w:val="18"/>
+        </w:rPr>
+        <w:t xml:space="preserve">play-services-location = { group = "com.google.android.gms", name = "play-services-location", version.ref = "playServicesLocation" }</w:t>
+      </w:r>
+    </w:p>
+    <w:p>
+      <w:pPr>
+        <w:shd w:val="clear" w:color="auto" w:fill="F2F2F2"/>
+        <w:spacing w:after="0" w:line="240" w:lineRule="auto"/>
+      </w:pPr>
+      <w:r>
+        <w:rPr>
+          <w:rFonts w:ascii="Consolas" w:hAnsi="Consolas" w:cs="Consolas"/>
+          <w:noProof/>
+          <w:sz w:val="18"/>
+        </w:rPr>
+        <w:t xml:space="preserve">androidx-security-crypto = { group = "androidx.security", name = "security-crypto", version.ref = "securityCrypto" }</w:t>
+      </w:r>
+    </w:p>
+    <w:p>
+      <w:pPr>
+        <w:shd w:val="clear" w:color="auto" w:fill="F2F2F2"/>
+        <w:spacing w:after="0" w:line="240" w:lineRule="auto"/>
+      </w:pPr>
+    </w:p>
+    <w:p>
+      <w:pPr>
+        <w:shd w:val="clear" w:color="auto" w:fill="F2F2F2"/>
+        <w:spacing w:after="0" w:line="240" w:lineRule="auto"/>
+      </w:pPr>
+      <w:r>
+        <w:rPr>
+          <w:rFonts w:ascii="Consolas" w:hAnsi="Consolas" w:cs="Consolas"/>
+          <w:noProof/>
+          <w:sz w:val="18"/>
+        </w:rPr>
+        <w:t xml:space="preserve">[plugins]</w:t>
+      </w:r>
+    </w:p>
+    <w:p>
+      <w:pPr>
+        <w:shd w:val="clear" w:color="auto" w:fill="F2F2F2"/>
+        <w:spacing w:after="0" w:line="240" w:lineRule="auto"/>
+      </w:pPr>
+      <w:r>
+        <w:rPr>
+          <w:rFonts w:ascii="Consolas" w:hAnsi="Consolas" w:cs="Consolas"/>
+          <w:noProof/>
+          <w:sz w:val="18"/>
+        </w:rPr>
+        <w:t xml:space="preserve">android-application = { id = "com.android.application", version.ref = "agp" }</w:t>
+      </w:r>
+    </w:p>
+    <w:p>
+      <w:pPr>
+        <w:spacing w:after="0"/>
+      </w:pPr>
+    </w:p>
+    <w:p>
+      <w:pPr>
+        <w:keepNext/>
+        <w:spacing w:before="240" w:after="120"/>
+      </w:pPr>
+      <w:r>
+        <w:rPr>
+          <w:b/>
+          <w:highlight w:val="yellow"/>
+        </w:rPr>
+        <w:t xml:space="preserve">app/build.gradle.kts (Módulo de App)</w:t>
+      </w:r>
+    </w:p>
+    <w:p>
+      <w:pPr>
+        <w:shd w:val="clear" w:color="auto" w:fill="F2F2F2"/>
+        <w:spacing w:after="0" w:line="240" w:lineRule="auto"/>
+      </w:pPr>
+      <w:r>
+        <w:rPr>
+          <w:rFonts w:ascii="Consolas" w:hAnsi="Consolas" w:cs="Consolas"/>
+          <w:noProof/>
+          <w:sz w:val="18"/>
+        </w:rPr>
+        <w:t xml:space="preserve">plugins {</w:t>
+      </w:r>
+    </w:p>
+    <w:p>
+      <w:pPr>
+        <w:shd w:val="clear" w:color="auto" w:fill="F2F2F2"/>
+        <w:spacing w:after="0" w:line="240" w:lineRule="auto"/>
+      </w:pPr>
+      <w:r>
+        <w:rPr>
+          <w:rFonts w:ascii="Consolas" w:hAnsi="Consolas" w:cs="Consolas"/>
+          <w:noProof/>
+          <w:sz w:val="18"/>
+        </w:rPr>
+        <w:t xml:space="preserve">    alias(libs.plugins.android.application)</w:t>
+      </w:r>
+    </w:p>
+    <w:p>
+      <w:pPr>
+        <w:shd w:val="clear" w:color="auto" w:fill="F2F2F2"/>
+        <w:spacing w:after="0" w:line="240" w:lineRule="auto"/>
+      </w:pPr>
+      <w:r>
+        <w:rPr>
+          <w:rFonts w:ascii="Consolas" w:hAnsi="Consolas" w:cs="Consolas"/>
+          <w:noProof/>
+          <w:sz w:val="18"/>
+        </w:rPr>
+        <w:t xml:space="preserve">}</w:t>
+      </w:r>
+    </w:p>
+    <w:p>
+      <w:pPr>
+        <w:shd w:val="clear" w:color="auto" w:fill="F2F2F2"/>
+        <w:spacing w:after="0" w:line="240" w:lineRule="auto"/>
+      </w:pPr>
+    </w:p>
+    <w:p>
+      <w:pPr>
+        <w:shd w:val="clear" w:color="auto" w:fill="F2F2F2"/>
+        <w:spacing w:after="0" w:line="240" w:lineRule="auto"/>
+      </w:pPr>
+      <w:r>
+        <w:rPr>
+          <w:rFonts w:ascii="Consolas" w:hAnsi="Consolas" w:cs="Consolas"/>
+          <w:noProof/>
+          <w:sz w:val="18"/>
+        </w:rPr>
+        <w:t xml:space="preserve">android {</w:t>
+      </w:r>
+    </w:p>
+    <w:p>
+      <w:pPr>
+        <w:shd w:val="clear" w:color="auto" w:fill="F2F2F2"/>
+        <w:spacing w:after="0" w:line="240" w:lineRule="auto"/>
+      </w:pPr>
+      <w:r>
+        <w:rPr>
+          <w:rFonts w:ascii="Consolas" w:hAnsi="Consolas" w:cs="Consolas"/>
+          <w:noProof/>
+          <w:sz w:val="18"/>
+        </w:rPr>
+        <w:t xml:space="preserve">    // Con AGP 8+ el paquete se declara aquí y no en el atributo package del Manifest</w:t>
+      </w:r>
+    </w:p>
+    <w:p>
+      <w:pPr>
+        <w:shd w:val="clear" w:color="auto" w:fill="F2F2F2"/>
+        <w:spacing w:after="0" w:line="240" w:lineRule="auto"/>
+      </w:pPr>
+      <w:r>
+        <w:rPr>
+          <w:rFonts w:ascii="Consolas" w:hAnsi="Consolas" w:cs="Consolas"/>
+          <w:noProof/>
+          <w:sz w:val="18"/>
+        </w:rPr>
+        <w:t xml:space="preserve">    namespace = "com.example.geocheckin"</w:t>
+      </w:r>
+    </w:p>
+    <w:p>
+      <w:pPr>
+        <w:shd w:val="clear" w:color="auto" w:fill="F2F2F2"/>
+        <w:spacing w:after="0" w:line="240" w:lineRule="auto"/>
+      </w:pPr>
+      <w:r>
+        <w:rPr>
+          <w:rFonts w:ascii="Consolas" w:hAnsi="Consolas" w:cs="Consolas"/>
+          <w:noProof/>
+          <w:sz w:val="18"/>
+        </w:rPr>
+        <w:t xml:space="preserve">    compileSdk {</w:t>
+      </w:r>
+    </w:p>
+    <w:p>
+      <w:pPr>
+        <w:shd w:val="clear" w:color="auto" w:fill="F2F2F2"/>
+        <w:spacing w:after="0" w:line="240" w:lineRule="auto"/>
+      </w:pPr>
+      <w:r>
+        <w:rPr>
+          <w:rFonts w:ascii="Consolas" w:hAnsi="Consolas" w:cs="Consolas"/>
+          <w:noProof/>
+          <w:sz w:val="18"/>
+        </w:rPr>
+        <w:t xml:space="preserve">        version = release(37)</w:t>
+      </w:r>
+    </w:p>
+    <w:p>
+      <w:pPr>
+        <w:shd w:val="clear" w:color="auto" w:fill="F2F2F2"/>
+        <w:spacing w:after="0" w:line="240" w:lineRule="auto"/>
+      </w:pPr>
+      <w:r>
+        <w:rPr>
+          <w:rFonts w:ascii="Consolas" w:hAnsi="Consolas" w:cs="Consolas"/>
+          <w:noProof/>
+          <w:sz w:val="18"/>
+        </w:rPr>
+        <w:t xml:space="preserve">    }</w:t>
+      </w:r>
+    </w:p>
+    <w:p>
+      <w:pPr>
+        <w:shd w:val="clear" w:color="auto" w:fill="F2F2F2"/>
+        <w:spacing w:after="0" w:line="240" w:lineRule="auto"/>
+      </w:pPr>
+    </w:p>
+    <w:p>
+      <w:pPr>
+        <w:shd w:val="clear" w:color="auto" w:fill="F2F2F2"/>
+        <w:spacing w:after="0" w:line="240" w:lineRule="auto"/>
+      </w:pPr>
+      <w:r>
+        <w:rPr>
+          <w:rFonts w:ascii="Consolas" w:hAnsi="Consolas" w:cs="Consolas"/>
+          <w:noProof/>
+          <w:sz w:val="18"/>
+        </w:rPr>
+        <w:t xml:space="preserve">    defaultConfig {</w:t>
+      </w:r>
+    </w:p>
+    <w:p>
+      <w:pPr>
+        <w:shd w:val="clear" w:color="auto" w:fill="F2F2F2"/>
+        <w:spacing w:after="0" w:line="240" w:lineRule="auto"/>
+      </w:pPr>
+      <w:r>
+        <w:rPr>
+          <w:rFonts w:ascii="Consolas" w:hAnsi="Consolas" w:cs="Consolas"/>
+          <w:noProof/>
+          <w:sz w:val="18"/>
+        </w:rPr>
+        <w:t xml:space="preserve">        applicationId = "com.example.geocheckin"</w:t>
+      </w:r>
+    </w:p>
+    <w:p>
+      <w:pPr>
+        <w:shd w:val="clear" w:color="auto" w:fill="F2F2F2"/>
+        <w:spacing w:after="0" w:line="240" w:lineRule="auto"/>
+      </w:pPr>
+      <w:r>
+        <w:rPr>
+          <w:rFonts w:ascii="Consolas" w:hAnsi="Consolas" w:cs="Consolas"/>
+          <w:noProof/>
+          <w:sz w:val="18"/>
+        </w:rPr>
+        <w:t xml:space="preserve">        minSdk = 24</w:t>
+      </w:r>
+    </w:p>
+    <w:p>
+      <w:pPr>
+        <w:shd w:val="clear" w:color="auto" w:fill="F2F2F2"/>
+        <w:spacing w:after="0" w:line="240" w:lineRule="auto"/>
+      </w:pPr>
+      <w:r>
+        <w:rPr>
+          <w:rFonts w:ascii="Consolas" w:hAnsi="Consolas" w:cs="Consolas"/>
+          <w:noProof/>
+          <w:sz w:val="18"/>
+        </w:rPr>
+        <w:t xml:space="preserve">        targetSdk = 37</w:t>
+      </w:r>
+    </w:p>
+    <w:p>
+      <w:pPr>
+        <w:shd w:val="clear" w:color="auto" w:fill="F2F2F2"/>
+        <w:spacing w:after="0" w:line="240" w:lineRule="auto"/>
+      </w:pPr>
+      <w:r>
+        <w:rPr>
+          <w:rFonts w:ascii="Consolas" w:hAnsi="Consolas" w:cs="Consolas"/>
+          <w:noProof/>
+          <w:sz w:val="18"/>
+        </w:rPr>
+        <w:t xml:space="preserve">        versionCode = 1</w:t>
+      </w:r>
+    </w:p>
+    <w:p>
+      <w:pPr>
+        <w:shd w:val="clear" w:color="auto" w:fill="F2F2F2"/>
+        <w:spacing w:after="0" w:line="240" w:lineRule="auto"/>
+      </w:pPr>
+      <w:r>
+        <w:rPr>
+          <w:rFonts w:ascii="Consolas" w:hAnsi="Consolas" w:cs="Consolas"/>
+          <w:noProof/>
+          <w:sz w:val="18"/>
+        </w:rPr>
+        <w:t xml:space="preserve">        versionName = "1.0"</w:t>
+      </w:r>
+    </w:p>
+    <w:p>
+      <w:pPr>
+        <w:shd w:val="clear" w:color="auto" w:fill="F2F2F2"/>
+        <w:spacing w:after="0" w:line="240" w:lineRule="auto"/>
+      </w:pPr>
+      <w:r>
+        <w:rPr>
+          <w:rFonts w:ascii="Consolas" w:hAnsi="Consolas" w:cs="Consolas"/>
+          <w:noProof/>
+          <w:sz w:val="18"/>
+        </w:rPr>
+        <w:t xml:space="preserve">    }</w:t>
+      </w:r>
+    </w:p>
+    <w:p>
+      <w:pPr>
+        <w:shd w:val="clear" w:color="auto" w:fill="F2F2F2"/>
+        <w:spacing w:after="0" w:line="240" w:lineRule="auto"/>
+      </w:pPr>
+    </w:p>
+    <w:p>
+      <w:pPr>
+        <w:shd w:val="clear" w:color="auto" w:fill="F2F2F2"/>
+        <w:spacing w:after="0" w:line="240" w:lineRule="auto"/>
+      </w:pPr>
+      <w:r>
+        <w:rPr>
+          <w:rFonts w:ascii="Consolas" w:hAnsi="Consolas" w:cs="Consolas"/>
+          <w:noProof/>
+          <w:sz w:val="18"/>
+        </w:rPr>
+        <w:t xml:space="preserve">    buildTypes {</w:t>
+      </w:r>
+    </w:p>
+    <w:p>
+      <w:pPr>
+        <w:shd w:val="clear" w:color="auto" w:fill="F2F2F2"/>
+        <w:spacing w:after="0" w:line="240" w:lineRule="auto"/>
+      </w:pPr>
+      <w:r>
+        <w:rPr>
+          <w:rFonts w:ascii="Consolas" w:hAnsi="Consolas" w:cs="Consolas"/>
+          <w:noProof/>
+          <w:sz w:val="18"/>
+        </w:rPr>
+        <w:t xml:space="preserve">        release {</w:t>
+      </w:r>
+    </w:p>
+    <w:p>
+      <w:pPr>
+        <w:shd w:val="clear" w:color="auto" w:fill="F2F2F2"/>
+        <w:spacing w:after="0" w:line="240" w:lineRule="auto"/>
+      </w:pPr>
+      <w:r>
+        <w:rPr>
+          <w:rFonts w:ascii="Consolas" w:hAnsi="Consolas" w:cs="Consolas"/>
+          <w:noProof/>
+          <w:sz w:val="18"/>
+        </w:rPr>
+        <w:t xml:space="preserve">            optimization {</w:t>
+      </w:r>
+    </w:p>
+    <w:p>
+      <w:pPr>
+        <w:shd w:val="clear" w:color="auto" w:fill="F2F2F2"/>
+        <w:spacing w:after="0" w:line="240" w:lineRule="auto"/>
+      </w:pPr>
+      <w:r>
+        <w:rPr>
+          <w:rFonts w:ascii="Consolas" w:hAnsi="Consolas" w:cs="Consolas"/>
+          <w:noProof/>
+          <w:sz w:val="18"/>
+        </w:rPr>
+        <w:t xml:space="preserve">                enable = false</w:t>
+      </w:r>
+    </w:p>
+    <w:p>
+      <w:pPr>
+        <w:shd w:val="clear" w:color="auto" w:fill="F2F2F2"/>
+        <w:spacing w:after="0" w:line="240" w:lineRule="auto"/>
+      </w:pPr>
+      <w:r>
+        <w:rPr>
+          <w:rFonts w:ascii="Consolas" w:hAnsi="Consolas" w:cs="Consolas"/>
+          <w:noProof/>
+          <w:sz w:val="18"/>
+        </w:rPr>
+        <w:t xml:space="preserve">            }</w:t>
+      </w:r>
+    </w:p>
+    <w:p>
+      <w:pPr>
+        <w:shd w:val="clear" w:color="auto" w:fill="F2F2F2"/>
+        <w:spacing w:after="0" w:line="240" w:lineRule="auto"/>
+      </w:pPr>
+      <w:r>
+        <w:rPr>
+          <w:rFonts w:ascii="Consolas" w:hAnsi="Consolas" w:cs="Consolas"/>
+          <w:noProof/>
+          <w:sz w:val="18"/>
+        </w:rPr>
+        <w:t xml:space="preserve">        }</w:t>
+      </w:r>
+    </w:p>
+    <w:p>
+      <w:pPr>
+        <w:shd w:val="clear" w:color="auto" w:fill="F2F2F2"/>
+        <w:spacing w:after="0" w:line="240" w:lineRule="auto"/>
+      </w:pPr>
+      <w:r>
+        <w:rPr>
+          <w:rFonts w:ascii="Consolas" w:hAnsi="Consolas" w:cs="Consolas"/>
+          <w:noProof/>
+          <w:sz w:val="18"/>
+        </w:rPr>
+        <w:t xml:space="preserve">    }</w:t>
+      </w:r>
+    </w:p>
+    <w:p>
+      <w:pPr>
+        <w:shd w:val="clear" w:color="auto" w:fill="F2F2F2"/>
+        <w:spacing w:after="0" w:line="240" w:lineRule="auto"/>
+      </w:pPr>
+      <w:r>
+        <w:rPr>
+          <w:rFonts w:ascii="Consolas" w:hAnsi="Consolas" w:cs="Consolas"/>
+          <w:noProof/>
+          <w:sz w:val="18"/>
+        </w:rPr>
+        <w:t xml:space="preserve">    compileOptions {</w:t>
+      </w:r>
+    </w:p>
+    <w:p>
+      <w:pPr>
+        <w:shd w:val="clear" w:color="auto" w:fill="F2F2F2"/>
+        <w:spacing w:after="0" w:line="240" w:lineRule="auto"/>
+      </w:pPr>
+      <w:r>
+        <w:rPr>
+          <w:rFonts w:ascii="Consolas" w:hAnsi="Consolas" w:cs="Consolas"/>
+          <w:noProof/>
+          <w:sz w:val="18"/>
+        </w:rPr>
+        <w:t xml:space="preserve">        sourceCompatibility = JavaVersion.VERSION_11</w:t>
+      </w:r>
+    </w:p>
+    <w:p>
+      <w:pPr>
+        <w:shd w:val="clear" w:color="auto" w:fill="F2F2F2"/>
+        <w:spacing w:after="0" w:line="240" w:lineRule="auto"/>
+      </w:pPr>
+      <w:r>
+        <w:rPr>
+          <w:rFonts w:ascii="Consolas" w:hAnsi="Consolas" w:cs="Consolas"/>
+          <w:noProof/>
+          <w:sz w:val="18"/>
+        </w:rPr>
+        <w:t xml:space="preserve">        targetCompatibility = JavaVersion.VERSION_11</w:t>
+      </w:r>
+    </w:p>
+    <w:p>
+      <w:pPr>
+        <w:shd w:val="clear" w:color="auto" w:fill="F2F2F2"/>
+        <w:spacing w:after="0" w:line="240" w:lineRule="auto"/>
+      </w:pPr>
+      <w:r>
+        <w:rPr>
+          <w:rFonts w:ascii="Consolas" w:hAnsi="Consolas" w:cs="Consolas"/>
+          <w:noProof/>
+          <w:sz w:val="18"/>
+        </w:rPr>
+        <w:t xml:space="preserve">    }</w:t>
+      </w:r>
+    </w:p>
+    <w:p>
+      <w:pPr>
+        <w:shd w:val="clear" w:color="auto" w:fill="F2F2F2"/>
+        <w:spacing w:after="0" w:line="240" w:lineRule="auto"/>
+      </w:pPr>
+      <w:r>
+        <w:rPr>
+          <w:rFonts w:ascii="Consolas" w:hAnsi="Consolas" w:cs="Consolas"/>
+          <w:noProof/>
+          <w:sz w:val="18"/>
+        </w:rPr>
+        <w:t xml:space="preserve">}</w:t>
+      </w:r>
+    </w:p>
+    <w:p>
+      <w:pPr>
+        <w:shd w:val="clear" w:color="auto" w:fill="F2F2F2"/>
+        <w:spacing w:after="0" w:line="240" w:lineRule="auto"/>
+      </w:pPr>
+    </w:p>
+    <w:p>
+      <w:pPr>
+        <w:shd w:val="clear" w:color="auto" w:fill="F2F2F2"/>
+        <w:spacing w:after="0" w:line="240" w:lineRule="auto"/>
+      </w:pPr>
+      <w:r>
+        <w:rPr>
+          <w:rFonts w:ascii="Consolas" w:hAnsi="Consolas" w:cs="Consolas"/>
+          <w:noProof/>
+          <w:sz w:val="18"/>
+        </w:rPr>
+        <w:t xml:space="preserve">dependencies {</w:t>
+      </w:r>
+    </w:p>
+    <w:p>
+      <w:pPr>
+        <w:shd w:val="clear" w:color="auto" w:fill="F2F2F2"/>
+        <w:spacing w:after="0" w:line="240" w:lineRule="auto"/>
+      </w:pPr>
+      <w:r>
+        <w:rPr>
+          <w:rFonts w:ascii="Consolas" w:hAnsi="Consolas" w:cs="Consolas"/>
+          <w:noProof/>
+          <w:sz w:val="18"/>
+        </w:rPr>
+        <w:t xml:space="preserve">    // Servicios de Ubicación de Google Play</w:t>
+      </w:r>
+    </w:p>
+    <w:p>
+      <w:pPr>
+        <w:shd w:val="clear" w:color="auto" w:fill="F2F2F2"/>
+        <w:spacing w:after="0" w:line="240" w:lineRule="auto"/>
+      </w:pPr>
+      <w:r>
+        <w:rPr>
+          <w:rFonts w:ascii="Consolas" w:hAnsi="Consolas" w:cs="Consolas"/>
+          <w:noProof/>
+          <w:sz w:val="18"/>
+        </w:rPr>
+        <w:t xml:space="preserve">    implementation(libs.play.services.location)</w:t>
+      </w:r>
+    </w:p>
+    <w:p>
+      <w:pPr>
+        <w:shd w:val="clear" w:color="auto" w:fill="F2F2F2"/>
+        <w:spacing w:after="0" w:line="240" w:lineRule="auto"/>
+      </w:pPr>
+    </w:p>
+    <w:p>
+      <w:pPr>
+        <w:shd w:val="clear" w:color="auto" w:fill="F2F2F2"/>
+        <w:spacing w:after="0" w:line="240" w:lineRule="auto"/>
+      </w:pPr>
+      <w:r>
+        <w:rPr>
+          <w:rFonts w:ascii="Consolas" w:hAnsi="Consolas" w:cs="Consolas"/>
+          <w:noProof/>
+          <w:sz w:val="18"/>
+        </w:rPr>
+        <w:t xml:space="preserve">    // Jetpack Security (Keystore + EncryptedSharedPreferences)</w:t>
+      </w:r>
+    </w:p>
+    <w:p>
+      <w:pPr>
+        <w:shd w:val="clear" w:color="auto" w:fill="F2F2F2"/>
+        <w:spacing w:after="0" w:line="240" w:lineRule="auto"/>
+      </w:pPr>
+      <w:r>
+        <w:rPr>
+          <w:rFonts w:ascii="Consolas" w:hAnsi="Consolas" w:cs="Consolas"/>
+          <w:noProof/>
+          <w:sz w:val="18"/>
+        </w:rPr>
+        <w:t xml:space="preserve">    // Nota: Google marcó esta librería como obsoleta (ver Conclusiones del documento)</w:t>
+      </w:r>
+    </w:p>
+    <w:p>
+      <w:pPr>
+        <w:shd w:val="clear" w:color="auto" w:fill="F2F2F2"/>
+        <w:spacing w:after="0" w:line="240" w:lineRule="auto"/>
+      </w:pPr>
+      <w:r>
+        <w:rPr>
+          <w:rFonts w:ascii="Consolas" w:hAnsi="Consolas" w:cs="Consolas"/>
+          <w:noProof/>
+          <w:sz w:val="18"/>
+        </w:rPr>
+        <w:t xml:space="preserve">    implementation(libs.androidx.security.crypto)</w:t>
+      </w:r>
+    </w:p>
+    <w:p>
+      <w:pPr>
+        <w:shd w:val="clear" w:color="auto" w:fill="F2F2F2"/>
+        <w:spacing w:after="0" w:line="240" w:lineRule="auto"/>
+      </w:pPr>
+    </w:p>
+    <w:p>
+      <w:pPr>
+        <w:shd w:val="clear" w:color="auto" w:fill="F2F2F2"/>
+        <w:spacing w:after="0" w:line="240" w:lineRule="auto"/>
+      </w:pPr>
+      <w:r>
+        <w:rPr>
+          <w:rFonts w:ascii="Consolas" w:hAnsi="Consolas" w:cs="Consolas"/>
+          <w:noProof/>
+          <w:sz w:val="18"/>
+        </w:rPr>
+        <w:t xml:space="preserve">    // Componentes de Arquitectura</w:t>
+      </w:r>
+    </w:p>
+    <w:p>
+      <w:pPr>
+        <w:shd w:val="clear" w:color="auto" w:fill="F2F2F2"/>
+        <w:spacing w:after="0" w:line="240" w:lineRule="auto"/>
+      </w:pPr>
+      <w:r>
+        <w:rPr>
+          <w:rFonts w:ascii="Consolas" w:hAnsi="Consolas" w:cs="Consolas"/>
+          <w:noProof/>
+          <w:sz w:val="18"/>
+        </w:rPr>
+        <w:t xml:space="preserve">    implementation(libs.androidx.core.ktx)</w:t>
+      </w:r>
+    </w:p>
+    <w:p>
+      <w:pPr>
+        <w:shd w:val="clear" w:color="auto" w:fill="F2F2F2"/>
+        <w:spacing w:after="0" w:line="240" w:lineRule="auto"/>
+      </w:pPr>
+      <w:r>
+        <w:rPr>
+          <w:rFonts w:ascii="Consolas" w:hAnsi="Consolas" w:cs="Consolas"/>
+          <w:noProof/>
+          <w:sz w:val="18"/>
+        </w:rPr>
+        <w:t xml:space="preserve">    implementation(libs.androidx.appcompat)</w:t>
+      </w:r>
+    </w:p>
+    <w:p>
+      <w:pPr>
+        <w:shd w:val="clear" w:color="auto" w:fill="F2F2F2"/>
+        <w:spacing w:after="0" w:line="240" w:lineRule="auto"/>
+      </w:pPr>
+      <w:r>
+        <w:rPr>
+          <w:rFonts w:ascii="Consolas" w:hAnsi="Consolas" w:cs="Consolas"/>
+          <w:noProof/>
+          <w:sz w:val="18"/>
+        </w:rPr>
+        <w:t xml:space="preserve">    implementation(libs.material)</w:t>
+      </w:r>
+    </w:p>
+    <w:p>
+      <w:pPr>
+        <w:shd w:val="clear" w:color="auto" w:fill="F2F2F2"/>
+        <w:spacing w:after="0" w:line="240" w:lineRule="auto"/>
+      </w:pPr>
+      <w:r>
+        <w:rPr>
+          <w:rFonts w:ascii="Consolas" w:hAnsi="Consolas" w:cs="Consolas"/>
+          <w:noProof/>
+          <w:sz w:val="18"/>
+        </w:rPr>
+        <w:t xml:space="preserve">}</w:t>
+      </w:r>
+    </w:p>
+    <w:p>
+      <w:pPr>
+        <w:spacing w:after="0"/>
+      </w:pPr>
+    </w:p>
+    <w:p>
+      <w:pPr>
+        <w:keepNext/>
+        <w:spacing w:before="240" w:after="120"/>
+      </w:pPr>
+      <w:r>
+        <w:rPr>
+          <w:b/>
+          <w:highlight w:val="yellow"/>
+        </w:rPr>
         <w:t xml:space="preserve">res/values/strings.xml</w:t>
       </w:r>
     </w:p>
@@ -1149,21 +1681,21 @@
           <w:noProof/>
           <w:sz w:val="18"/>
         </w:rPr>
-        <w:t xml:space="preserve">    &lt;string name="status_initial"&gt;Presione el botón para fichar...&lt;/string&gt;</w:t>
-      </w:r>
-    </w:p>
-    <w:p>
-      <w:pPr>
-        <w:shd w:val="clear" w:color="auto" w:fill="F2F2F2"/>
-        <w:spacing w:after="0" w:line="240" w:lineRule="auto"/>
-      </w:pPr>
-      <w:r>
-        <w:rPr>
-          <w:rFonts w:ascii="Consolas" w:hAnsi="Consolas" w:cs="Consolas"/>
-          <w:noProof/>
-          <w:sz w:val="18"/>
-        </w:rPr>
-        <w:t xml:space="preserve">    &lt;string name="status_locating"&gt;Obteniendo ubicación segura...&lt;/string&gt;</w:t>
+        <w:t xml:space="preserve">    &lt;string name="status_initial"&gt;Presione el botón para fichar…&lt;/string&gt;</w:t>
+      </w:r>
+    </w:p>
+    <w:p>
+      <w:pPr>
+        <w:shd w:val="clear" w:color="auto" w:fill="F2F2F2"/>
+        <w:spacing w:after="0" w:line="240" w:lineRule="auto"/>
+      </w:pPr>
+      <w:r>
+        <w:rPr>
+          <w:rFonts w:ascii="Consolas" w:hAnsi="Consolas" w:cs="Consolas"/>
+          <w:noProof/>
+          <w:sz w:val="18"/>
+        </w:rPr>
+        <w:t xml:space="preserve">    &lt;string name="status_locating"&gt;Obteniendo ubicación segura…&lt;/string&gt;</w:t>
       </w:r>
     </w:p>
     <w:p>
@@ -1318,6 +1850,80 @@
           <w:sz w:val="18"/>
         </w:rPr>
         <w:t xml:space="preserve">    &lt;string name="btn_cancel"&gt;Cancelar&lt;/string&gt;</w:t>
+      </w:r>
+    </w:p>
+    <w:p>
+      <w:pPr>
+        <w:shd w:val="clear" w:color="auto" w:fill="F2F2F2"/>
+        <w:spacing w:after="0" w:line="240" w:lineRule="auto"/>
+      </w:pPr>
+      <w:r>
+        <w:rPr>
+          <w:rFonts w:ascii="Consolas" w:hAnsi="Consolas" w:cs="Consolas"/>
+          <w:noProof/>
+          <w:sz w:val="18"/>
+        </w:rPr>
+        <w:t xml:space="preserve">&lt;/resources&gt;</w:t>
+      </w:r>
+    </w:p>
+    <w:p>
+      <w:pPr>
+        <w:spacing w:after="0"/>
+      </w:pPr>
+    </w:p>
+    <w:p>
+      <w:pPr>
+        <w:keepNext/>
+        <w:spacing w:before="240" w:after="120"/>
+      </w:pPr>
+      <w:r>
+        <w:rPr>
+          <w:b/>
+          <w:highlight w:val="yellow"/>
+        </w:rPr>
+        <w:t xml:space="preserve">res/values/themes.xml</w:t>
+      </w:r>
+    </w:p>
+    <w:p>
+      <w:pPr>
+        <w:shd w:val="clear" w:color="auto" w:fill="F2F2F2"/>
+        <w:spacing w:after="0" w:line="240" w:lineRule="auto"/>
+      </w:pPr>
+      <w:r>
+        <w:rPr>
+          <w:rFonts w:ascii="Consolas" w:hAnsi="Consolas" w:cs="Consolas"/>
+          <w:noProof/>
+          <w:sz w:val="18"/>
+        </w:rPr>
+        <w:t xml:space="preserve">&lt;resources&gt;</w:t>
+      </w:r>
+    </w:p>
+    <w:p>
+      <w:pPr>
+        <w:shd w:val="clear" w:color="auto" w:fill="F2F2F2"/>
+        <w:spacing w:after="0" w:line="240" w:lineRule="auto"/>
+      </w:pPr>
+      <w:r>
+        <w:rPr>
+          <w:rFonts w:ascii="Consolas" w:hAnsi="Consolas" w:cs="Consolas"/>
+          <w:noProof/>
+          <w:sz w:val="18"/>
+        </w:rPr>
+        <w:t xml:space="preserve">    &lt;!-- Sin ActionBar: el título se muestra en el layout y la vista se adapta a edge-to-edge (Android 15+) --&gt;</w:t>
+      </w:r>
+    </w:p>
+    <w:p>
+      <w:pPr>
+        <w:shd w:val="clear" w:color="auto" w:fill="F2F2F2"/>
+        <w:spacing w:after="0" w:line="240" w:lineRule="auto"/>
+      </w:pPr>
+      <w:r>
+        <w:rPr>
+          <w:rFonts w:ascii="Consolas" w:hAnsi="Consolas" w:cs="Consolas"/>
+          <w:noProof/>
+          <w:sz w:val="18"/>
+        </w:rPr>
+        <w:t xml:space="preserve">    &lt;style name="Theme.GeoCheckIn" parent="Theme.MaterialComponents.DayNight.NoActionBar" /&gt;</w:t>
       </w:r>
     </w:p>
     <w:p>
@@ -1372,6 +1978,40 @@
           <w:noProof/>
           <w:sz w:val="18"/>
         </w:rPr>
+        <w:t xml:space="preserve">// security-crypto está obsoleta, pero se usa en este ejercicio (ver Conclusiones del documento)</w:t>
+      </w:r>
+    </w:p>
+    <w:p>
+      <w:pPr>
+        <w:shd w:val="clear" w:color="auto" w:fill="F2F2F2"/>
+        <w:spacing w:after="0" w:line="240" w:lineRule="auto"/>
+      </w:pPr>
+      <w:r>
+        <w:rPr>
+          <w:rFonts w:ascii="Consolas" w:hAnsi="Consolas" w:cs="Consolas"/>
+          <w:noProof/>
+          <w:sz w:val="18"/>
+        </w:rPr>
+        <w:t xml:space="preserve">@file:Suppress("DEPRECATION")</w:t>
+      </w:r>
+    </w:p>
+    <w:p>
+      <w:pPr>
+        <w:shd w:val="clear" w:color="auto" w:fill="F2F2F2"/>
+        <w:spacing w:after="0" w:line="240" w:lineRule="auto"/>
+      </w:pPr>
+    </w:p>
+    <w:p>
+      <w:pPr>
+        <w:shd w:val="clear" w:color="auto" w:fill="F2F2F2"/>
+        <w:spacing w:after="0" w:line="240" w:lineRule="auto"/>
+      </w:pPr>
+      <w:r>
+        <w:rPr>
+          <w:rFonts w:ascii="Consolas" w:hAnsi="Consolas" w:cs="Consolas"/>
+          <w:noProof/>
+          <w:sz w:val="18"/>
+        </w:rPr>
         <w:t xml:space="preserve">package com.example.geocheckin</w:t>
       </w:r>
     </w:p>
@@ -1462,6 +2102,20 @@
           <w:noProof/>
           <w:sz w:val="18"/>
         </w:rPr>
+        <w:t xml:space="preserve">import androidx.core.content.edit</w:t>
+      </w:r>
+    </w:p>
+    <w:p>
+      <w:pPr>
+        <w:shd w:val="clear" w:color="auto" w:fill="F2F2F2"/>
+        <w:spacing w:after="0" w:line="240" w:lineRule="auto"/>
+      </w:pPr>
+      <w:r>
+        <w:rPr>
+          <w:rFonts w:ascii="Consolas" w:hAnsi="Consolas" w:cs="Consolas"/>
+          <w:noProof/>
+          <w:sz w:val="18"/>
+        </w:rPr>
         <w:t xml:space="preserve">import androidx.security.crypto.EncryptedSharedPreferences</w:t>
       </w:r>
     </w:p>
@@ -1752,7 +2406,7 @@
           <w:noProof/>
           <w:sz w:val="18"/>
         </w:rPr>
-        <w:t xml:space="preserve">        sharedPreferences.edit().putString(KEY_CHECKIN_TOKEN, token).apply()</w:t>
+        <w:t xml:space="preserve">        sharedPreferences.edit { putString(KEY_CHECKIN_TOKEN, token) }</w:t>
       </w:r>
     </w:p>
     <w:p>
@@ -2229,6 +2883,14 @@
         <w:jc w:val="both"/>
       </w:pPr>
       <w:r>
+        <w:t xml:space="preserve">Como el proyecto apunta a Android 15+ (edge-to-edge), la vista raíz aplica los insets de las barras del sistema para que el contenido no quede debajo de ellas.</w:t>
+      </w:r>
+    </w:p>
+    <w:p>
+      <w:pPr>
+        <w:jc w:val="both"/>
+      </w:pPr>
+      <w:r>
         <w:t xml:space="preserve">Flujo del fichaje: (1) se comprueba el permiso de ubicación precisa y, si el usuario lo rechazó antes, se explica el motivo con un diálogo; (2) se obtiene la ubicación actual con alta precisión; (3) se rechaza si es simulada; (4) se verifica que esté dentro del radio de la zona de trabajo; (5) se genera el token, se firma y se guarda cifrado. En pantalla solo se muestra un fragmento del token, nunca el valor completo.</w:t>
       </w:r>
     </w:p>
@@ -2347,6 +3009,20 @@
           <w:noProof/>
           <w:sz w:val="18"/>
         </w:rPr>
+        <w:t xml:space="preserve">import android.view.View</w:t>
+      </w:r>
+    </w:p>
+    <w:p>
+      <w:pPr>
+        <w:shd w:val="clear" w:color="auto" w:fill="F2F2F2"/>
+        <w:spacing w:after="0" w:line="240" w:lineRule="auto"/>
+      </w:pPr>
+      <w:r>
+        <w:rPr>
+          <w:rFonts w:ascii="Consolas" w:hAnsi="Consolas" w:cs="Consolas"/>
+          <w:noProof/>
+          <w:sz w:val="18"/>
+        </w:rPr>
         <w:t xml:space="preserve">import android.widget.Button</w:t>
       </w:r>
     </w:p>
@@ -2445,6 +3121,34 @@
           <w:noProof/>
           <w:sz w:val="18"/>
         </w:rPr>
+        <w:t xml:space="preserve">import androidx.core.view.ViewCompat</w:t>
+      </w:r>
+    </w:p>
+    <w:p>
+      <w:pPr>
+        <w:shd w:val="clear" w:color="auto" w:fill="F2F2F2"/>
+        <w:spacing w:after="0" w:line="240" w:lineRule="auto"/>
+      </w:pPr>
+      <w:r>
+        <w:rPr>
+          <w:rFonts w:ascii="Consolas" w:hAnsi="Consolas" w:cs="Consolas"/>
+          <w:noProof/>
+          <w:sz w:val="18"/>
+        </w:rPr>
+        <w:t xml:space="preserve">import androidx.core.view.WindowInsetsCompat</w:t>
+      </w:r>
+    </w:p>
+    <w:p>
+      <w:pPr>
+        <w:shd w:val="clear" w:color="auto" w:fill="F2F2F2"/>
+        <w:spacing w:after="0" w:line="240" w:lineRule="auto"/>
+      </w:pPr>
+      <w:r>
+        <w:rPr>
+          <w:rFonts w:ascii="Consolas" w:hAnsi="Consolas" w:cs="Consolas"/>
+          <w:noProof/>
+          <w:sz w:val="18"/>
+        </w:rPr>
         <w:t xml:space="preserve">import com.google.android.gms.location.FusedLocationProviderClient</w:t>
       </w:r>
     </w:p>
@@ -2980,6 +3684,194 @@
           <w:sz w:val="18"/>
         </w:rPr>
         <w:t xml:space="preserve">        setContentView(R.layout.activity_main)</w:t>
+      </w:r>
+    </w:p>
+    <w:p>
+      <w:pPr>
+        <w:shd w:val="clear" w:color="auto" w:fill="F2F2F2"/>
+        <w:spacing w:after="0" w:line="240" w:lineRule="auto"/>
+      </w:pPr>
+    </w:p>
+    <w:p>
+      <w:pPr>
+        <w:shd w:val="clear" w:color="auto" w:fill="F2F2F2"/>
+        <w:spacing w:after="0" w:line="240" w:lineRule="auto"/>
+      </w:pPr>
+      <w:r>
+        <w:rPr>
+          <w:rFonts w:ascii="Consolas" w:hAnsi="Consolas" w:cs="Consolas"/>
+          <w:noProof/>
+          <w:sz w:val="18"/>
+        </w:rPr>
+        <w:t xml:space="preserve">        // Desde Android 15 la app se dibuja bajo las barras del sistema (edge-to-edge)</w:t>
+      </w:r>
+    </w:p>
+    <w:p>
+      <w:pPr>
+        <w:shd w:val="clear" w:color="auto" w:fill="F2F2F2"/>
+        <w:spacing w:after="0" w:line="240" w:lineRule="auto"/>
+      </w:pPr>
+      <w:r>
+        <w:rPr>
+          <w:rFonts w:ascii="Consolas" w:hAnsi="Consolas" w:cs="Consolas"/>
+          <w:noProof/>
+          <w:sz w:val="18"/>
+        </w:rPr>
+        <w:t xml:space="preserve">        val root = findViewById&lt;View&gt;(R.id.main)</w:t>
+      </w:r>
+    </w:p>
+    <w:p>
+      <w:pPr>
+        <w:shd w:val="clear" w:color="auto" w:fill="F2F2F2"/>
+        <w:spacing w:after="0" w:line="240" w:lineRule="auto"/>
+      </w:pPr>
+      <w:r>
+        <w:rPr>
+          <w:rFonts w:ascii="Consolas" w:hAnsi="Consolas" w:cs="Consolas"/>
+          <w:noProof/>
+          <w:sz w:val="18"/>
+        </w:rPr>
+        <w:t xml:space="preserve">        val basePadding = root.paddingTop</w:t>
+      </w:r>
+    </w:p>
+    <w:p>
+      <w:pPr>
+        <w:shd w:val="clear" w:color="auto" w:fill="F2F2F2"/>
+        <w:spacing w:after="0" w:line="240" w:lineRule="auto"/>
+      </w:pPr>
+      <w:r>
+        <w:rPr>
+          <w:rFonts w:ascii="Consolas" w:hAnsi="Consolas" w:cs="Consolas"/>
+          <w:noProof/>
+          <w:sz w:val="18"/>
+        </w:rPr>
+        <w:t xml:space="preserve">        ViewCompat.setOnApplyWindowInsetsListener(root) { view, insets -&gt;</w:t>
+      </w:r>
+    </w:p>
+    <w:p>
+      <w:pPr>
+        <w:shd w:val="clear" w:color="auto" w:fill="F2F2F2"/>
+        <w:spacing w:after="0" w:line="240" w:lineRule="auto"/>
+      </w:pPr>
+      <w:r>
+        <w:rPr>
+          <w:rFonts w:ascii="Consolas" w:hAnsi="Consolas" w:cs="Consolas"/>
+          <w:noProof/>
+          <w:sz w:val="18"/>
+        </w:rPr>
+        <w:t xml:space="preserve">            val bars = insets.getInsets(WindowInsetsCompat.Type.systemBars())</w:t>
+      </w:r>
+    </w:p>
+    <w:p>
+      <w:pPr>
+        <w:shd w:val="clear" w:color="auto" w:fill="F2F2F2"/>
+        <w:spacing w:after="0" w:line="240" w:lineRule="auto"/>
+      </w:pPr>
+      <w:r>
+        <w:rPr>
+          <w:rFonts w:ascii="Consolas" w:hAnsi="Consolas" w:cs="Consolas"/>
+          <w:noProof/>
+          <w:sz w:val="18"/>
+        </w:rPr>
+        <w:t xml:space="preserve">            view.setPadding(</w:t>
+      </w:r>
+    </w:p>
+    <w:p>
+      <w:pPr>
+        <w:shd w:val="clear" w:color="auto" w:fill="F2F2F2"/>
+        <w:spacing w:after="0" w:line="240" w:lineRule="auto"/>
+      </w:pPr>
+      <w:r>
+        <w:rPr>
+          <w:rFonts w:ascii="Consolas" w:hAnsi="Consolas" w:cs="Consolas"/>
+          <w:noProof/>
+          <w:sz w:val="18"/>
+        </w:rPr>
+        <w:t xml:space="preserve">                basePadding + bars.left,</w:t>
+      </w:r>
+    </w:p>
+    <w:p>
+      <w:pPr>
+        <w:shd w:val="clear" w:color="auto" w:fill="F2F2F2"/>
+        <w:spacing w:after="0" w:line="240" w:lineRule="auto"/>
+      </w:pPr>
+      <w:r>
+        <w:rPr>
+          <w:rFonts w:ascii="Consolas" w:hAnsi="Consolas" w:cs="Consolas"/>
+          <w:noProof/>
+          <w:sz w:val="18"/>
+        </w:rPr>
+        <w:t xml:space="preserve">                basePadding + bars.top,</w:t>
+      </w:r>
+    </w:p>
+    <w:p>
+      <w:pPr>
+        <w:shd w:val="clear" w:color="auto" w:fill="F2F2F2"/>
+        <w:spacing w:after="0" w:line="240" w:lineRule="auto"/>
+      </w:pPr>
+      <w:r>
+        <w:rPr>
+          <w:rFonts w:ascii="Consolas" w:hAnsi="Consolas" w:cs="Consolas"/>
+          <w:noProof/>
+          <w:sz w:val="18"/>
+        </w:rPr>
+        <w:t xml:space="preserve">                basePadding + bars.right,</w:t>
+      </w:r>
+    </w:p>
+    <w:p>
+      <w:pPr>
+        <w:shd w:val="clear" w:color="auto" w:fill="F2F2F2"/>
+        <w:spacing w:after="0" w:line="240" w:lineRule="auto"/>
+      </w:pPr>
+      <w:r>
+        <w:rPr>
+          <w:rFonts w:ascii="Consolas" w:hAnsi="Consolas" w:cs="Consolas"/>
+          <w:noProof/>
+          <w:sz w:val="18"/>
+        </w:rPr>
+        <w:t xml:space="preserve">                basePadding + bars.bottom</w:t>
+      </w:r>
+    </w:p>
+    <w:p>
+      <w:pPr>
+        <w:shd w:val="clear" w:color="auto" w:fill="F2F2F2"/>
+        <w:spacing w:after="0" w:line="240" w:lineRule="auto"/>
+      </w:pPr>
+      <w:r>
+        <w:rPr>
+          <w:rFonts w:ascii="Consolas" w:hAnsi="Consolas" w:cs="Consolas"/>
+          <w:noProof/>
+          <w:sz w:val="18"/>
+        </w:rPr>
+        <w:t xml:space="preserve">            )</w:t>
+      </w:r>
+    </w:p>
+    <w:p>
+      <w:pPr>
+        <w:shd w:val="clear" w:color="auto" w:fill="F2F2F2"/>
+        <w:spacing w:after="0" w:line="240" w:lineRule="auto"/>
+      </w:pPr>
+      <w:r>
+        <w:rPr>
+          <w:rFonts w:ascii="Consolas" w:hAnsi="Consolas" w:cs="Consolas"/>
+          <w:noProof/>
+          <w:sz w:val="18"/>
+        </w:rPr>
+        <w:t xml:space="preserve">            insets</w:t>
+      </w:r>
+    </w:p>
+    <w:p>
+      <w:pPr>
+        <w:shd w:val="clear" w:color="auto" w:fill="F2F2F2"/>
+        <w:spacing w:after="0" w:line="240" w:lineRule="auto"/>
+      </w:pPr>
+      <w:r>
+        <w:rPr>
+          <w:rFonts w:ascii="Consolas" w:hAnsi="Consolas" w:cs="Consolas"/>
+          <w:noProof/>
+          <w:sz w:val="18"/>
+        </w:rPr>
+        <w:t xml:space="preserve">        }</w:t>
       </w:r>
     </w:p>
     <w:p>
@@ -4642,6 +5534,20 @@
           <w:noProof/>
           <w:sz w:val="18"/>
         </w:rPr>
+        <w:t xml:space="preserve">    android:id="@+id/main"</w:t>
+      </w:r>
+    </w:p>
+    <w:p>
+      <w:pPr>
+        <w:shd w:val="clear" w:color="auto" w:fill="F2F2F2"/>
+        <w:spacing w:after="0" w:line="240" w:lineRule="auto"/>
+      </w:pPr>
+      <w:r>
+        <w:rPr>
+          <w:rFonts w:ascii="Consolas" w:hAnsi="Consolas" w:cs="Consolas"/>
+          <w:noProof/>
+          <w:sz w:val="18"/>
+        </w:rPr>
         <w:t xml:space="preserve">    android:layout_width="match_parent"</w:t>
       </w:r>
     </w:p>
@@ -5152,7 +6058,7 @@
       </w:r>
       <w:r>
         <w:tab/>
-        <w:t xml:space="preserve">La librería androidx.security:security-crypto está en versión alfa y Google la marcó como obsoleta; una alternativa a futuro es Jetpack DataStore junto con Google Tink.</w:t>
+        <w:t xml:space="preserve">Google marcó la librería androidx.security:security-crypto como obsoleta (el código suprime esas advertencias de forma explícita); una alternativa a futuro es Jetpack DataStore junto con Google Tink.</w:t>
       </w:r>
     </w:p>
     <w:p>

</xml_diff>